<commit_message>
Add August fuel scenarios to brief
</commit_message>
<xml_diff>
--- a/archive/results/july_2026_fuel_trajectory_20260713/july_august_2026_scenario_brief.docx
+++ b/archive/results/july_2026_fuel_trajectory_20260713/july_august_2026_scenario_brief.docx
@@ -35,7 +35,7 @@
     </w:p>
     <w:p>
       <w:r>
-        <w:t>Июньский ИПЦ составил 101,06. В июле нет обычной индексации ЖКУ, но сохраняется риск дорогого топлива. Наиболее обоснованная рабочая точка для обсуждения — 101,40, то есть +1,40% к предыдущему месяцу. KPI-коридор шириной ±0,5 п.п. составляет 100,90–101,90.</w:t>
+        <w:t>Июньский ИПЦ составил 101,06. В июле нет обычной индексации ЖКУ, но сохраняется риск дорогого топлива. Рабочая точка на июль — 101,40, то есть +1,40% к предыдущему месяцу; KPI-коридор — 100,90–101,90. Центральный ориентир на август — 100,50, или +0,50%.</w:t>
       </w:r>
     </w:p>
     <w:p>
@@ -645,9 +645,198 @@
     </w:tbl>
     <w:p>
       <w:r>
-        <w:t>В текущем ориентире +0,50% уже предполагается умеренный перенос топлива на доставку, товары и услуги. Сильный перенос может поднять август к +0,70–0,80%, даже если бензин не растёт второй раз.</w:t>
+        <w:t>Центральный ориентир на август — 100,50, или +0,50%. Он предполагает отсутствие нового прямого топливного вклада относительно уже высокого июля и умеренный перенос через доставку, товары и услуги.</w:t>
       </w:r>
     </w:p>
+    <w:p>
+      <w:pPr>
+        <w:pStyle w:val="Heading1"/>
+      </w:pPr>
+      <w:r>
+        <w:t>Сценарии августа</w:t>
+      </w:r>
+    </w:p>
+    <w:tbl>
+      <w:tblPr>
+        <w:tblStyle w:val="TableGrid"/>
+        <w:tblW w:type="auto" w:w="0"/>
+        <w:tblLook w:firstColumn="1" w:firstRow="1" w:lastColumn="0" w:lastRow="0" w:noHBand="0" w:noVBand="1" w:val="04A0"/>
+      </w:tblPr>
+      <w:tblGrid>
+        <w:gridCol w:w="2160"/>
+        <w:gridCol w:w="2160"/>
+        <w:gridCol w:w="2160"/>
+        <w:gridCol w:w="2160"/>
+      </w:tblGrid>
+      <w:tr>
+        <w:tc>
+          <w:tcPr>
+            <w:tcW w:type="dxa" w:w="2160"/>
+          </w:tcPr>
+          <w:p>
+            <w:r>
+              <w:t>Сценарий</w:t>
+            </w:r>
+          </w:p>
+        </w:tc>
+        <w:tc>
+          <w:tcPr>
+            <w:tcW w:type="dxa" w:w="2160"/>
+          </w:tcPr>
+          <w:p>
+            <w:r>
+              <w:t>ИПЦ, индекс</w:t>
+            </w:r>
+          </w:p>
+        </w:tc>
+        <w:tc>
+          <w:tcPr>
+            <w:tcW w:type="dxa" w:w="2160"/>
+          </w:tcPr>
+          <w:p>
+            <w:r>
+              <w:t>MoM</w:t>
+            </w:r>
+          </w:p>
+        </w:tc>
+        <w:tc>
+          <w:tcPr>
+            <w:tcW w:type="dxa" w:w="2160"/>
+          </w:tcPr>
+          <w:p>
+            <w:r>
+              <w:t>Что должно произойти</w:t>
+            </w:r>
+          </w:p>
+        </w:tc>
+      </w:tr>
+      <w:tr>
+        <w:tc>
+          <w:tcPr>
+            <w:tcW w:type="dxa" w:w="2160"/>
+          </w:tcPr>
+          <w:p>
+            <w:r>
+              <w:t>Быстрый откат</w:t>
+            </w:r>
+          </w:p>
+        </w:tc>
+        <w:tc>
+          <w:tcPr>
+            <w:tcW w:type="dxa" w:w="2160"/>
+          </w:tcPr>
+          <w:p>
+            <w:r>
+              <w:t>99,95</w:t>
+            </w:r>
+          </w:p>
+        </w:tc>
+        <w:tc>
+          <w:tcPr>
+            <w:tcW w:type="dxa" w:w="2160"/>
+          </w:tcPr>
+          <w:p>
+            <w:r>
+              <w:t>−0,05%</w:t>
+            </w:r>
+          </w:p>
+        </w:tc>
+        <w:tc>
+          <w:tcPr>
+            <w:tcW w:type="dxa" w:w="2160"/>
+          </w:tcPr>
+          <w:p>
+            <w:r>
+              <w:t>Цена топлива возвращается к уровню 29.06; появляется отрицательный прямой вклад.</w:t>
+            </w:r>
+          </w:p>
+        </w:tc>
+      </w:tr>
+      <w:tr>
+        <w:tc>
+          <w:tcPr>
+            <w:tcW w:type="dxa" w:w="2160"/>
+          </w:tcPr>
+          <w:p>
+            <w:r>
+              <w:t>Рабочий</w:t>
+            </w:r>
+          </w:p>
+        </w:tc>
+        <w:tc>
+          <w:tcPr>
+            <w:tcW w:type="dxa" w:w="2160"/>
+          </w:tcPr>
+          <w:p>
+            <w:r>
+              <w:t>100,50</w:t>
+            </w:r>
+          </w:p>
+        </w:tc>
+        <w:tc>
+          <w:tcPr>
+            <w:tcW w:type="dxa" w:w="2160"/>
+          </w:tcPr>
+          <w:p>
+            <w:r>
+              <w:t>+0,50%</w:t>
+            </w:r>
+          </w:p>
+        </w:tc>
+        <w:tc>
+          <w:tcPr>
+            <w:tcW w:type="dxa" w:w="2160"/>
+          </w:tcPr>
+          <w:p>
+            <w:r>
+              <w:t>Цена топлива удерживается; прямой вклад близок к нулю, сохраняется умеренный перенос.</w:t>
+            </w:r>
+          </w:p>
+        </w:tc>
+      </w:tr>
+      <w:tr>
+        <w:tc>
+          <w:tcPr>
+            <w:tcW w:type="dxa" w:w="2160"/>
+          </w:tcPr>
+          <w:p>
+            <w:r>
+              <w:t>Лаговый стресс</w:t>
+            </w:r>
+          </w:p>
+        </w:tc>
+        <w:tc>
+          <w:tcPr>
+            <w:tcW w:type="dxa" w:w="2160"/>
+          </w:tcPr>
+          <w:p>
+            <w:r>
+              <w:t>100,75</w:t>
+            </w:r>
+          </w:p>
+        </w:tc>
+        <w:tc>
+          <w:tcPr>
+            <w:tcW w:type="dxa" w:w="2160"/>
+          </w:tcPr>
+          <w:p>
+            <w:r>
+              <w:t>+0,75%</w:t>
+            </w:r>
+          </w:p>
+        </w:tc>
+        <w:tc>
+          <w:tcPr>
+            <w:tcW w:type="dxa" w:w="2160"/>
+          </w:tcPr>
+          <w:p>
+            <w:r>
+              <w:t>Цена топлива удерживается на высоком июльском уровне; усиливаются ожидания и логистика без второго прямого вклада.</w:t>
+            </w:r>
+          </w:p>
+        </w:tc>
+      </w:tr>
+    </w:tbl>
     <w:p>
       <w:pPr>
         <w:pStyle w:val="Heading1"/>
@@ -847,7 +1036,7 @@
     </w:p>
     <w:p>
       <w:r>
-        <w:t>«Наиболее обоснованная рабочая оценка на июль — 101,40, или +1,40% к предыдущему месяцу. Рабочий KPI-коридор — 100,90–101,90. Отсутствие июльской индексации ЖКУ сдерживает инфляцию, а дорогой бензин и его перенос в стоимость доставки поддерживают риск вверх. На август основной ориентир — около +0,50%; его пересмотр зависит от того, начнут ли цены топлива снижаться или продолжат расти относительно июля.»</w:t>
+        <w:t>«Наиболее обоснованная рабочая оценка на июль — 101,40, или +1,40% к предыдущему месяцу. Рабочий KPI-коридор — 100,90–101,90. Отсутствие июльской индексации ЖКУ сдерживает инфляцию, а дорогой бензин и его перенос в стоимость доставки поддерживают риск вверх. Центральный ориентир на август — 100,50, или +0,50%; его пересмотр зависит от того, начнут ли цены топлива снижаться или продолжат расти относительно июля.»</w:t>
       </w:r>
     </w:p>
     <w:p>

</xml_diff>

<commit_message>
Correct August scenario contribution
</commit_message>
<xml_diff>
--- a/archive/results/july_2026_fuel_trajectory_20260713/july_august_2026_scenario_brief.docx
+++ b/archive/results/july_2026_fuel_trajectory_20260713/july_august_2026_scenario_brief.docx
@@ -717,7 +717,7 @@
           </w:tcPr>
           <w:p>
             <w:r>
-              <w:t>Быстрый откат</w:t>
+              <w:t>Низкая nonfuel-база</w:t>
             </w:r>
           </w:p>
         </w:tc>
@@ -747,7 +747,7 @@
           </w:tcPr>
           <w:p>
             <w:r>
-              <w:t>Цена топлива возвращается к уровню 29.06; появляется отрицательный прямой вклад.</w:t>
+              <w:t>Топливо уже вернулось к уровню 29.06 в июле; в августе прямой вклад равен нулю, итог задаёт nonfuel-база −0,05 п.п.</w:t>
             </w:r>
           </w:p>
         </w:tc>

</xml_diff>

<commit_message>
Add year-end trajectory to scenario brief
</commit_message>
<xml_diff>
--- a/archive/results/july_2026_fuel_trajectory_20260713/july_august_2026_scenario_brief.docx
+++ b/archive/results/july_2026_fuel_trajectory_20260713/july_august_2026_scenario_brief.docx
@@ -717,7 +717,7 @@
           </w:tcPr>
           <w:p>
             <w:r>
-              <w:t>Низкая nonfuel-база</w:t>
+              <w:t>Низкая нетопливная база</w:t>
             </w:r>
           </w:p>
         </w:tc>
@@ -747,7 +747,7 @@
           </w:tcPr>
           <w:p>
             <w:r>
-              <w:t>Топливо уже вернулось к уровню 29.06 в июле; в августе прямой вклад равен нулю, итог задаёт nonfuel-база −0,05 п.п.</w:t>
+              <w:t>Топливо уже вернулось к уровню 29.06 в июле; в августе прямой вклад равен нулю, итог задаёт нетопливная база −0,05 п.п.</w:t>
             </w:r>
           </w:p>
         </w:tc>
@@ -837,6 +837,256 @@
         </w:tc>
       </w:tr>
     </w:tbl>
+    <w:p>
+      <w:pPr>
+        <w:pStyle w:val="Heading1"/>
+      </w:pPr>
+      <w:r>
+        <w:t>Центральная траектория до декабря 2026</w:t>
+      </w:r>
+    </w:p>
+    <w:tbl>
+      <w:tblPr>
+        <w:tblStyle w:val="TableGrid"/>
+        <w:tblW w:type="auto" w:w="0"/>
+        <w:tblLook w:firstColumn="1" w:firstRow="1" w:lastColumn="0" w:lastRow="0" w:noHBand="0" w:noVBand="1" w:val="04A0"/>
+      </w:tblPr>
+      <w:tblGrid>
+        <w:gridCol w:w="2880"/>
+        <w:gridCol w:w="2880"/>
+        <w:gridCol w:w="2880"/>
+      </w:tblGrid>
+      <w:tr>
+        <w:tc>
+          <w:tcPr>
+            <w:tcW w:type="dxa" w:w="2880"/>
+          </w:tcPr>
+          <w:p>
+            <w:r>
+              <w:t>Месяц</w:t>
+            </w:r>
+          </w:p>
+        </w:tc>
+        <w:tc>
+          <w:tcPr>
+            <w:tcW w:type="dxa" w:w="2880"/>
+          </w:tcPr>
+          <w:p>
+            <w:r>
+              <w:t>ИПЦ, индекс</w:t>
+            </w:r>
+          </w:p>
+        </w:tc>
+        <w:tc>
+          <w:tcPr>
+            <w:tcW w:type="dxa" w:w="2880"/>
+          </w:tcPr>
+          <w:p>
+            <w:r>
+              <w:t>MoM</w:t>
+            </w:r>
+          </w:p>
+        </w:tc>
+      </w:tr>
+      <w:tr>
+        <w:tc>
+          <w:tcPr>
+            <w:tcW w:type="dxa" w:w="2880"/>
+          </w:tcPr>
+          <w:p>
+            <w:r>
+              <w:t>Июль</w:t>
+            </w:r>
+          </w:p>
+        </w:tc>
+        <w:tc>
+          <w:tcPr>
+            <w:tcW w:type="dxa" w:w="2880"/>
+          </w:tcPr>
+          <w:p>
+            <w:r>
+              <w:t>101,40</w:t>
+            </w:r>
+          </w:p>
+        </w:tc>
+        <w:tc>
+          <w:tcPr>
+            <w:tcW w:type="dxa" w:w="2880"/>
+          </w:tcPr>
+          <w:p>
+            <w:r>
+              <w:t>+1,40%</w:t>
+            </w:r>
+          </w:p>
+        </w:tc>
+      </w:tr>
+      <w:tr>
+        <w:tc>
+          <w:tcPr>
+            <w:tcW w:type="dxa" w:w="2880"/>
+          </w:tcPr>
+          <w:p>
+            <w:r>
+              <w:t>Август</w:t>
+            </w:r>
+          </w:p>
+        </w:tc>
+        <w:tc>
+          <w:tcPr>
+            <w:tcW w:type="dxa" w:w="2880"/>
+          </w:tcPr>
+          <w:p>
+            <w:r>
+              <w:t>100,50</w:t>
+            </w:r>
+          </w:p>
+        </w:tc>
+        <w:tc>
+          <w:tcPr>
+            <w:tcW w:type="dxa" w:w="2880"/>
+          </w:tcPr>
+          <w:p>
+            <w:r>
+              <w:t>+0,50%</w:t>
+            </w:r>
+          </w:p>
+        </w:tc>
+      </w:tr>
+      <w:tr>
+        <w:tc>
+          <w:tcPr>
+            <w:tcW w:type="dxa" w:w="2880"/>
+          </w:tcPr>
+          <w:p>
+            <w:r>
+              <w:t>Сентябрь</w:t>
+            </w:r>
+          </w:p>
+        </w:tc>
+        <w:tc>
+          <w:tcPr>
+            <w:tcW w:type="dxa" w:w="2880"/>
+          </w:tcPr>
+          <w:p>
+            <w:r>
+              <w:t>100,65</w:t>
+            </w:r>
+          </w:p>
+        </w:tc>
+        <w:tc>
+          <w:tcPr>
+            <w:tcW w:type="dxa" w:w="2880"/>
+          </w:tcPr>
+          <w:p>
+            <w:r>
+              <w:t>+0,65%</w:t>
+            </w:r>
+          </w:p>
+        </w:tc>
+      </w:tr>
+      <w:tr>
+        <w:tc>
+          <w:tcPr>
+            <w:tcW w:type="dxa" w:w="2880"/>
+          </w:tcPr>
+          <w:p>
+            <w:r>
+              <w:t>Октябрь</w:t>
+            </w:r>
+          </w:p>
+        </w:tc>
+        <w:tc>
+          <w:tcPr>
+            <w:tcW w:type="dxa" w:w="2880"/>
+          </w:tcPr>
+          <w:p>
+            <w:r>
+              <w:t>101,30</w:t>
+            </w:r>
+          </w:p>
+        </w:tc>
+        <w:tc>
+          <w:tcPr>
+            <w:tcW w:type="dxa" w:w="2880"/>
+          </w:tcPr>
+          <w:p>
+            <w:r>
+              <w:t>+1,30%</w:t>
+            </w:r>
+          </w:p>
+        </w:tc>
+      </w:tr>
+      <w:tr>
+        <w:tc>
+          <w:tcPr>
+            <w:tcW w:type="dxa" w:w="2880"/>
+          </w:tcPr>
+          <w:p>
+            <w:r>
+              <w:t>Ноябрь</w:t>
+            </w:r>
+          </w:p>
+        </w:tc>
+        <w:tc>
+          <w:tcPr>
+            <w:tcW w:type="dxa" w:w="2880"/>
+          </w:tcPr>
+          <w:p>
+            <w:r>
+              <w:t>100,45</w:t>
+            </w:r>
+          </w:p>
+        </w:tc>
+        <w:tc>
+          <w:tcPr>
+            <w:tcW w:type="dxa" w:w="2880"/>
+          </w:tcPr>
+          <w:p>
+            <w:r>
+              <w:t>+0,45%</w:t>
+            </w:r>
+          </w:p>
+        </w:tc>
+      </w:tr>
+      <w:tr>
+        <w:tc>
+          <w:tcPr>
+            <w:tcW w:type="dxa" w:w="2880"/>
+          </w:tcPr>
+          <w:p>
+            <w:r>
+              <w:t>Декабрь</w:t>
+            </w:r>
+          </w:p>
+        </w:tc>
+        <w:tc>
+          <w:tcPr>
+            <w:tcW w:type="dxa" w:w="2880"/>
+          </w:tcPr>
+          <w:p>
+            <w:r>
+              <w:t>100,50</w:t>
+            </w:r>
+          </w:p>
+        </w:tc>
+        <w:tc>
+          <w:tcPr>
+            <w:tcW w:type="dxa" w:w="2880"/>
+          </w:tcPr>
+          <w:p>
+            <w:r>
+              <w:t>+0,50%</w:t>
+            </w:r>
+          </w:p>
+        </w:tc>
+      </w:tr>
+    </w:tbl>
+    <w:p>
+      <w:pPr/>
+      <w:r>
+        <w:t>Расчётный итог Dec/Dec 2026: 109,23. Октябрьская точка содержит действующий policy-профиль тарифов ОПР-формы; она не является повторением июльской индексации.</w:t>
+      </w:r>
+    </w:p>
     <w:p>
       <w:pPr>
         <w:pStyle w:val="Heading1"/>

</xml_diff>